<commit_message>
Update report details with user name and registration number
</commit_message>
<xml_diff>
--- a/12308059.docx
+++ b/12308059.docx
@@ -352,7 +352,7 @@
           <w:b/>
           <w:sz w:val="24"/>
         </w:rPr>
-        <w:t>Sayandip Jana</w:t>
+        <w:t>Bonumahanti Prem Varaha Venkat Sai</w:t>
       </w:r>
       <w:r>
         <w:rPr>
@@ -406,7 +406,7 @@
           <w:b/>
           <w:sz w:val="24"/>
         </w:rPr>
-        <w:t>er : 12308059</w:t>
+        <w:t>er : 12322913</w:t>
       </w:r>
     </w:p>
     <w:p>
@@ -789,7 +789,7 @@
           <w:sz w:val="28"/>
           <w:szCs w:val="28"/>
         </w:rPr>
-        <w:t>Certified that this project report “BUILD FIVE MACHINE LEARNING MODELS FOR MULTIPLE DISEASE PREDICTION” is the Bonafide work of  “SAYANDIP JANA” who carried out the project work under my supervision.</w:t>
+        <w:t>Certified that this project report “BUILD FIVE MACHINE LEARNING MODELS FOR MULTIPLE DISEASE PREDICTION” is the Bonafide work of  “BONUMAHANTI PREM VARAHA VENKAT SAI” who carried out the project work under my supervision.</w:t>
       </w:r>
     </w:p>
     <w:p>
@@ -852,7 +852,7 @@
           <w:sz w:val="28"/>
           <w:szCs w:val="28"/>
         </w:rPr>
-        <w:t>SAYANDIP JANA</w:t>
+        <w:t>BONUMAHANTI PREM VARAHA VENKAT SAI</w:t>
       </w:r>
     </w:p>
     <w:p>
@@ -1261,7 +1261,7 @@
           <w:sz w:val="24"/>
           <w:szCs w:val="24"/>
         </w:rPr>
-        <w:t>Sayandip Jana</w:t>
+        <w:t>Bonumahanti Prem Varaha Venkat Sai</w:t>
       </w:r>
     </w:p>
     <w:p>
@@ -1294,7 +1294,7 @@
           <w:sz w:val="24"/>
           <w:szCs w:val="24"/>
         </w:rPr>
-        <w:t xml:space="preserve"> 12308059</w:t>
+        <w:t xml:space="preserve"> 12322913</w:t>
       </w:r>
     </w:p>
     <w:p>

</xml_diff>